<commit_message>
Fix report font for Word compatibility and add HTML viewer
Use Malgun Gothic for docx text (fixes blank display on Windows Word),
and add an HTML report that opens directly in Cursor/browser.

Co-authored-by: choijunh-cloud <choijunh-cloud@users.noreply.github.com>
</commit_message>
<xml_diff>
--- a/lectures/8월 19일 Quick코멘트 시각화보고서.docx
+++ b/lectures/8월 19일 Quick코멘트 시각화보고서.docx
@@ -9,7 +9,7 @@
       </w:pPr>
       <w:r>
         <w:rPr>
-          <w:rFonts w:ascii="NanumGothic" w:hAnsi="NanumGothic" w:eastAsia="NanumGothic"/>
+          <w:rFonts w:ascii="Calibri" w:hAnsi="Calibri" w:eastAsia="맑은 고딕"/>
           <w:b w:val="0"/>
           <w:i w:val="0"/>
           <w:color w:val="4B5563"/>
@@ -25,7 +25,7 @@
       </w:pPr>
       <w:r>
         <w:rPr>
-          <w:rFonts w:ascii="NanumGothic" w:hAnsi="NanumGothic" w:eastAsia="NanumGothic"/>
+          <w:rFonts w:ascii="Calibri" w:hAnsi="Calibri" w:eastAsia="맑은 고딕"/>
           <w:b/>
           <w:i w:val="0"/>
           <w:color w:val="0F2043"/>
@@ -41,7 +41,7 @@
       </w:pPr>
       <w:r>
         <w:rPr>
-          <w:rFonts w:ascii="NanumGothic" w:hAnsi="NanumGothic" w:eastAsia="NanumGothic"/>
+          <w:rFonts w:ascii="Calibri" w:hAnsi="Calibri" w:eastAsia="맑은 고딕"/>
           <w:b w:val="0"/>
           <w:i w:val="0"/>
           <w:color w:val="1E407C"/>
@@ -80,7 +80,7 @@
             <w:r/>
             <w:r>
               <w:rPr>
-                <w:rFonts w:ascii="NanumGothic" w:hAnsi="NanumGothic" w:eastAsia="NanumGothic"/>
+                <w:rFonts w:ascii="Calibri" w:hAnsi="Calibri" w:eastAsia="맑은 고딕"/>
                 <w:b/>
                 <w:i w:val="0"/>
                 <w:color w:val="0F2043"/>
@@ -92,7 +92,7 @@
           <w:p>
             <w:r>
               <w:rPr>
-                <w:rFonts w:ascii="NanumGothic" w:hAnsi="NanumGothic" w:eastAsia="NanumGothic"/>
+                <w:rFonts w:ascii="Calibri" w:hAnsi="Calibri" w:eastAsia="맑은 고딕"/>
                 <w:b w:val="0"/>
                 <w:i w:val="0"/>
                 <w:color w:val="1A1A1A"/>
@@ -104,7 +104,7 @@
           <w:p>
             <w:r>
               <w:rPr>
-                <w:rFonts w:ascii="NanumGothic" w:hAnsi="NanumGothic" w:eastAsia="NanumGothic"/>
+                <w:rFonts w:ascii="Calibri" w:hAnsi="Calibri" w:eastAsia="맑은 고딕"/>
                 <w:b w:val="0"/>
                 <w:i w:val="0"/>
                 <w:color w:val="1A1A1A"/>
@@ -116,7 +116,7 @@
           <w:p>
             <w:r>
               <w:rPr>
-                <w:rFonts w:ascii="NanumGothic" w:hAnsi="NanumGothic" w:eastAsia="NanumGothic"/>
+                <w:rFonts w:ascii="Calibri" w:hAnsi="Calibri" w:eastAsia="맑은 고딕"/>
                 <w:b w:val="0"/>
                 <w:i w:val="0"/>
                 <w:color w:val="1A1A1A"/>
@@ -128,7 +128,7 @@
           <w:p>
             <w:r>
               <w:rPr>
-                <w:rFonts w:ascii="NanumGothic" w:hAnsi="NanumGothic" w:eastAsia="NanumGothic"/>
+                <w:rFonts w:ascii="Calibri" w:hAnsi="Calibri" w:eastAsia="맑은 고딕"/>
                 <w:b w:val="0"/>
                 <w:i w:val="0"/>
                 <w:color w:val="1A1A1A"/>
@@ -140,7 +140,7 @@
           <w:p>
             <w:r>
               <w:rPr>
-                <w:rFonts w:ascii="NanumGothic" w:hAnsi="NanumGothic" w:eastAsia="NanumGothic"/>
+                <w:rFonts w:ascii="Calibri" w:hAnsi="Calibri" w:eastAsia="맑은 고딕"/>
                 <w:b w:val="0"/>
                 <w:i w:val="0"/>
                 <w:color w:val="1A1A1A"/>
@@ -159,7 +159,7 @@
       </w:pPr>
       <w:r>
         <w:rPr>
-          <w:rFonts w:ascii="NanumGothic" w:hAnsi="NanumGothic" w:eastAsia="NanumGothic"/>
+          <w:rFonts w:ascii="Calibri" w:hAnsi="Calibri" w:eastAsia="맑은 고딕"/>
           <w:b/>
           <w:i w:val="0"/>
           <w:color w:val="1E407C"/>
@@ -206,7 +206,7 @@
             <w:r/>
             <w:r>
               <w:rPr>
-                <w:rFonts w:ascii="NanumGothic" w:hAnsi="NanumGothic" w:eastAsia="NanumGothic"/>
+                <w:rFonts w:ascii="Calibri" w:hAnsi="Calibri" w:eastAsia="맑은 고딕"/>
                 <w:b/>
                 <w:i w:val="0"/>
                 <w:color w:val="FFFFFF"/>
@@ -234,7 +234,7 @@
             <w:r/>
             <w:r>
               <w:rPr>
-                <w:rFonts w:ascii="NanumGothic" w:hAnsi="NanumGothic" w:eastAsia="NanumGothic"/>
+                <w:rFonts w:ascii="Calibri" w:hAnsi="Calibri" w:eastAsia="맑은 고딕"/>
                 <w:b/>
                 <w:i w:val="0"/>
                 <w:color w:val="FFFFFF"/>
@@ -262,7 +262,7 @@
             <w:r/>
             <w:r>
               <w:rPr>
-                <w:rFonts w:ascii="NanumGothic" w:hAnsi="NanumGothic" w:eastAsia="NanumGothic"/>
+                <w:rFonts w:ascii="Calibri" w:hAnsi="Calibri" w:eastAsia="맑은 고딕"/>
                 <w:b/>
                 <w:i w:val="0"/>
                 <w:color w:val="FFFFFF"/>
@@ -292,7 +292,7 @@
             <w:r/>
             <w:r>
               <w:rPr>
-                <w:rFonts w:ascii="NanumGothic" w:hAnsi="NanumGothic" w:eastAsia="NanumGothic"/>
+                <w:rFonts w:ascii="Calibri" w:hAnsi="Calibri" w:eastAsia="맑은 고딕"/>
                 <w:b/>
                 <w:i w:val="0"/>
                 <w:color w:val="1A1A1A"/>
@@ -320,7 +320,7 @@
             <w:r/>
             <w:r>
               <w:rPr>
-                <w:rFonts w:ascii="NanumGothic" w:hAnsi="NanumGothic" w:eastAsia="NanumGothic"/>
+                <w:rFonts w:ascii="Calibri" w:hAnsi="Calibri" w:eastAsia="맑은 고딕"/>
                 <w:b w:val="0"/>
                 <w:i w:val="0"/>
                 <w:color w:val="1A1A1A"/>
@@ -348,7 +348,7 @@
             <w:r/>
             <w:r>
               <w:rPr>
-                <w:rFonts w:ascii="NanumGothic" w:hAnsi="NanumGothic" w:eastAsia="NanumGothic"/>
+                <w:rFonts w:ascii="Calibri" w:hAnsi="Calibri" w:eastAsia="맑은 고딕"/>
                 <w:b w:val="0"/>
                 <w:i w:val="0"/>
                 <w:color w:val="1A1A1A"/>
@@ -378,7 +378,7 @@
             <w:r/>
             <w:r>
               <w:rPr>
-                <w:rFonts w:ascii="NanumGothic" w:hAnsi="NanumGothic" w:eastAsia="NanumGothic"/>
+                <w:rFonts w:ascii="Calibri" w:hAnsi="Calibri" w:eastAsia="맑은 고딕"/>
                 <w:b/>
                 <w:i w:val="0"/>
                 <w:color w:val="1A1A1A"/>
@@ -406,7 +406,7 @@
             <w:r/>
             <w:r>
               <w:rPr>
-                <w:rFonts w:ascii="NanumGothic" w:hAnsi="NanumGothic" w:eastAsia="NanumGothic"/>
+                <w:rFonts w:ascii="Calibri" w:hAnsi="Calibri" w:eastAsia="맑은 고딕"/>
                 <w:b w:val="0"/>
                 <w:i w:val="0"/>
                 <w:color w:val="1A1A1A"/>
@@ -434,7 +434,7 @@
             <w:r/>
             <w:r>
               <w:rPr>
-                <w:rFonts w:ascii="NanumGothic" w:hAnsi="NanumGothic" w:eastAsia="NanumGothic"/>
+                <w:rFonts w:ascii="Calibri" w:hAnsi="Calibri" w:eastAsia="맑은 고딕"/>
                 <w:b w:val="0"/>
                 <w:i w:val="0"/>
                 <w:color w:val="1A1A1A"/>
@@ -464,7 +464,7 @@
             <w:r/>
             <w:r>
               <w:rPr>
-                <w:rFonts w:ascii="NanumGothic" w:hAnsi="NanumGothic" w:eastAsia="NanumGothic"/>
+                <w:rFonts w:ascii="Calibri" w:hAnsi="Calibri" w:eastAsia="맑은 고딕"/>
                 <w:b/>
                 <w:i w:val="0"/>
                 <w:color w:val="1A1A1A"/>
@@ -492,7 +492,7 @@
             <w:r/>
             <w:r>
               <w:rPr>
-                <w:rFonts w:ascii="NanumGothic" w:hAnsi="NanumGothic" w:eastAsia="NanumGothic"/>
+                <w:rFonts w:ascii="Calibri" w:hAnsi="Calibri" w:eastAsia="맑은 고딕"/>
                 <w:b w:val="0"/>
                 <w:i w:val="0"/>
                 <w:color w:val="1A1A1A"/>
@@ -520,7 +520,7 @@
             <w:r/>
             <w:r>
               <w:rPr>
-                <w:rFonts w:ascii="NanumGothic" w:hAnsi="NanumGothic" w:eastAsia="NanumGothic"/>
+                <w:rFonts w:ascii="Calibri" w:hAnsi="Calibri" w:eastAsia="맑은 고딕"/>
                 <w:b w:val="0"/>
                 <w:i w:val="0"/>
                 <w:color w:val="1A1A1A"/>
@@ -550,7 +550,7 @@
             <w:r/>
             <w:r>
               <w:rPr>
-                <w:rFonts w:ascii="NanumGothic" w:hAnsi="NanumGothic" w:eastAsia="NanumGothic"/>
+                <w:rFonts w:ascii="Calibri" w:hAnsi="Calibri" w:eastAsia="맑은 고딕"/>
                 <w:b/>
                 <w:i w:val="0"/>
                 <w:color w:val="1A1A1A"/>
@@ -578,7 +578,7 @@
             <w:r/>
             <w:r>
               <w:rPr>
-                <w:rFonts w:ascii="NanumGothic" w:hAnsi="NanumGothic" w:eastAsia="NanumGothic"/>
+                <w:rFonts w:ascii="Calibri" w:hAnsi="Calibri" w:eastAsia="맑은 고딕"/>
                 <w:b w:val="0"/>
                 <w:i w:val="0"/>
                 <w:color w:val="1A1A1A"/>
@@ -606,7 +606,7 @@
             <w:r/>
             <w:r>
               <w:rPr>
-                <w:rFonts w:ascii="NanumGothic" w:hAnsi="NanumGothic" w:eastAsia="NanumGothic"/>
+                <w:rFonts w:ascii="Calibri" w:hAnsi="Calibri" w:eastAsia="맑은 고딕"/>
                 <w:b w:val="0"/>
                 <w:i w:val="0"/>
                 <w:color w:val="1A1A1A"/>
@@ -636,7 +636,7 @@
             <w:r/>
             <w:r>
               <w:rPr>
-                <w:rFonts w:ascii="NanumGothic" w:hAnsi="NanumGothic" w:eastAsia="NanumGothic"/>
+                <w:rFonts w:ascii="Calibri" w:hAnsi="Calibri" w:eastAsia="맑은 고딕"/>
                 <w:b/>
                 <w:i w:val="0"/>
                 <w:color w:val="1A1A1A"/>
@@ -664,7 +664,7 @@
             <w:r/>
             <w:r>
               <w:rPr>
-                <w:rFonts w:ascii="NanumGothic" w:hAnsi="NanumGothic" w:eastAsia="NanumGothic"/>
+                <w:rFonts w:ascii="Calibri" w:hAnsi="Calibri" w:eastAsia="맑은 고딕"/>
                 <w:b w:val="0"/>
                 <w:i w:val="0"/>
                 <w:color w:val="1A1A1A"/>
@@ -692,7 +692,7 @@
             <w:r/>
             <w:r>
               <w:rPr>
-                <w:rFonts w:ascii="NanumGothic" w:hAnsi="NanumGothic" w:eastAsia="NanumGothic"/>
+                <w:rFonts w:ascii="Calibri" w:hAnsi="Calibri" w:eastAsia="맑은 고딕"/>
                 <w:b w:val="0"/>
                 <w:i w:val="0"/>
                 <w:color w:val="1A1A1A"/>
@@ -722,7 +722,7 @@
             <w:r/>
             <w:r>
               <w:rPr>
-                <w:rFonts w:ascii="NanumGothic" w:hAnsi="NanumGothic" w:eastAsia="NanumGothic"/>
+                <w:rFonts w:ascii="Calibri" w:hAnsi="Calibri" w:eastAsia="맑은 고딕"/>
                 <w:b/>
                 <w:i w:val="0"/>
                 <w:color w:val="1A1A1A"/>
@@ -750,7 +750,7 @@
             <w:r/>
             <w:r>
               <w:rPr>
-                <w:rFonts w:ascii="NanumGothic" w:hAnsi="NanumGothic" w:eastAsia="NanumGothic"/>
+                <w:rFonts w:ascii="Calibri" w:hAnsi="Calibri" w:eastAsia="맑은 고딕"/>
                 <w:b w:val="0"/>
                 <w:i w:val="0"/>
                 <w:color w:val="1A1A1A"/>
@@ -778,7 +778,7 @@
             <w:r/>
             <w:r>
               <w:rPr>
-                <w:rFonts w:ascii="NanumGothic" w:hAnsi="NanumGothic" w:eastAsia="NanumGothic"/>
+                <w:rFonts w:ascii="Calibri" w:hAnsi="Calibri" w:eastAsia="맑은 고딕"/>
                 <w:b w:val="0"/>
                 <w:i w:val="0"/>
                 <w:color w:val="1A1A1A"/>
@@ -800,7 +800,7 @@
       </w:pPr>
       <w:r>
         <w:rPr>
-          <w:rFonts w:ascii="NanumGothic" w:hAnsi="NanumGothic" w:eastAsia="NanumGothic"/>
+          <w:rFonts w:ascii="Calibri" w:hAnsi="Calibri" w:eastAsia="맑은 고딕"/>
           <w:b/>
           <w:i w:val="0"/>
           <w:color w:val="B8943A"/>
@@ -810,7 +810,7 @@
       </w:r>
       <w:r>
         <w:rPr>
-          <w:rFonts w:ascii="NanumGothic" w:hAnsi="NanumGothic" w:eastAsia="NanumGothic"/>
+          <w:rFonts w:ascii="Calibri" w:hAnsi="Calibri" w:eastAsia="맑은 고딕"/>
           <w:b/>
           <w:i w:val="0"/>
           <w:color w:val="0F2043"/>
@@ -929,7 +929,7 @@
             <w:r/>
             <w:r>
               <w:rPr>
-                <w:rFonts w:ascii="NanumGothic" w:hAnsi="NanumGothic" w:eastAsia="NanumGothic"/>
+                <w:rFonts w:ascii="Calibri" w:hAnsi="Calibri" w:eastAsia="맑은 고딕"/>
                 <w:b/>
                 <w:i w:val="0"/>
                 <w:color w:val="0F2043"/>
@@ -941,7 +941,7 @@
           <w:p>
             <w:r>
               <w:rPr>
-                <w:rFonts w:ascii="NanumGothic" w:hAnsi="NanumGothic" w:eastAsia="NanumGothic"/>
+                <w:rFonts w:ascii="Calibri" w:hAnsi="Calibri" w:eastAsia="맑은 고딕"/>
                 <w:b w:val="0"/>
                 <w:i w:val="0"/>
                 <w:color w:val="1A1A1A"/>
@@ -953,7 +953,7 @@
           <w:p>
             <w:r>
               <w:rPr>
-                <w:rFonts w:ascii="NanumGothic" w:hAnsi="NanumGothic" w:eastAsia="NanumGothic"/>
+                <w:rFonts w:ascii="Calibri" w:hAnsi="Calibri" w:eastAsia="맑은 고딕"/>
                 <w:b w:val="0"/>
                 <w:i w:val="0"/>
                 <w:color w:val="1A1A1A"/>
@@ -965,7 +965,7 @@
           <w:p>
             <w:r>
               <w:rPr>
-                <w:rFonts w:ascii="NanumGothic" w:hAnsi="NanumGothic" w:eastAsia="NanumGothic"/>
+                <w:rFonts w:ascii="Calibri" w:hAnsi="Calibri" w:eastAsia="맑은 고딕"/>
                 <w:b w:val="0"/>
                 <w:i w:val="0"/>
                 <w:color w:val="1A1A1A"/>
@@ -977,7 +977,7 @@
           <w:p>
             <w:r>
               <w:rPr>
-                <w:rFonts w:ascii="NanumGothic" w:hAnsi="NanumGothic" w:eastAsia="NanumGothic"/>
+                <w:rFonts w:ascii="Calibri" w:hAnsi="Calibri" w:eastAsia="맑은 고딕"/>
                 <w:b w:val="0"/>
                 <w:i w:val="0"/>
                 <w:color w:val="1A1A1A"/>
@@ -997,7 +997,7 @@
       </w:pPr>
       <w:r>
         <w:rPr>
-          <w:rFonts w:ascii="NanumGothic" w:hAnsi="NanumGothic" w:eastAsia="NanumGothic"/>
+          <w:rFonts w:ascii="Calibri" w:hAnsi="Calibri" w:eastAsia="맑은 고딕"/>
           <w:b w:val="0"/>
           <w:i w:val="0"/>
           <w:color w:val="1E407C"/>
@@ -1007,7 +1007,7 @@
       </w:r>
       <w:r>
         <w:rPr>
-          <w:rFonts w:ascii="NanumGothic" w:hAnsi="NanumGothic" w:eastAsia="NanumGothic"/>
+          <w:rFonts w:ascii="Calibri" w:hAnsi="Calibri" w:eastAsia="맑은 고딕"/>
           <w:b/>
           <w:i w:val="0"/>
           <w:color w:val="1A1A1A"/>
@@ -1017,7 +1017,7 @@
       </w:r>
       <w:r>
         <w:rPr>
-          <w:rFonts w:ascii="NanumGothic" w:hAnsi="NanumGothic" w:eastAsia="NanumGothic"/>
+          <w:rFonts w:ascii="Calibri" w:hAnsi="Calibri" w:eastAsia="맑은 고딕"/>
           <w:b w:val="0"/>
           <w:i w:val="0"/>
           <w:color w:val="1A1A1A"/>
@@ -1033,7 +1033,7 @@
       </w:pPr>
       <w:r>
         <w:rPr>
-          <w:rFonts w:ascii="NanumGothic" w:hAnsi="NanumGothic" w:eastAsia="NanumGothic"/>
+          <w:rFonts w:ascii="Calibri" w:hAnsi="Calibri" w:eastAsia="맑은 고딕"/>
           <w:b w:val="0"/>
           <w:i w:val="0"/>
           <w:color w:val="1E407C"/>
@@ -1043,7 +1043,7 @@
       </w:r>
       <w:r>
         <w:rPr>
-          <w:rFonts w:ascii="NanumGothic" w:hAnsi="NanumGothic" w:eastAsia="NanumGothic"/>
+          <w:rFonts w:ascii="Calibri" w:hAnsi="Calibri" w:eastAsia="맑은 고딕"/>
           <w:b w:val="0"/>
           <w:i w:val="0"/>
           <w:color w:val="1A1A1A"/>
@@ -1059,7 +1059,7 @@
       </w:pPr>
       <w:r>
         <w:rPr>
-          <w:rFonts w:ascii="NanumGothic" w:hAnsi="NanumGothic" w:eastAsia="NanumGothic"/>
+          <w:rFonts w:ascii="Calibri" w:hAnsi="Calibri" w:eastAsia="맑은 고딕"/>
           <w:b w:val="0"/>
           <w:i w:val="0"/>
           <w:color w:val="1E407C"/>
@@ -1069,7 +1069,7 @@
       </w:r>
       <w:r>
         <w:rPr>
-          <w:rFonts w:ascii="NanumGothic" w:hAnsi="NanumGothic" w:eastAsia="NanumGothic"/>
+          <w:rFonts w:ascii="Calibri" w:hAnsi="Calibri" w:eastAsia="맑은 고딕"/>
           <w:b w:val="0"/>
           <w:i w:val="0"/>
           <w:color w:val="1A1A1A"/>
@@ -1087,7 +1087,7 @@
       </w:pPr>
       <w:r>
         <w:rPr>
-          <w:rFonts w:ascii="NanumGothic" w:hAnsi="NanumGothic" w:eastAsia="NanumGothic"/>
+          <w:rFonts w:ascii="Calibri" w:hAnsi="Calibri" w:eastAsia="맑은 고딕"/>
           <w:b/>
           <w:i w:val="0"/>
           <w:color w:val="B8943A"/>
@@ -1097,7 +1097,7 @@
       </w:r>
       <w:r>
         <w:rPr>
-          <w:rFonts w:ascii="NanumGothic" w:hAnsi="NanumGothic" w:eastAsia="NanumGothic"/>
+          <w:rFonts w:ascii="Calibri" w:hAnsi="Calibri" w:eastAsia="맑은 고딕"/>
           <w:b/>
           <w:i w:val="0"/>
           <w:color w:val="0F2043"/>
@@ -1153,7 +1153,7 @@
       </w:pPr>
       <w:r>
         <w:rPr>
-          <w:rFonts w:ascii="NanumGothic" w:hAnsi="NanumGothic" w:eastAsia="NanumGothic"/>
+          <w:rFonts w:ascii="Calibri" w:hAnsi="Calibri" w:eastAsia="맑은 고딕"/>
           <w:b w:val="0"/>
           <w:i w:val="0"/>
           <w:color w:val="1E407C"/>
@@ -1163,7 +1163,7 @@
       </w:r>
       <w:r>
         <w:rPr>
-          <w:rFonts w:ascii="NanumGothic" w:hAnsi="NanumGothic" w:eastAsia="NanumGothic"/>
+          <w:rFonts w:ascii="Calibri" w:hAnsi="Calibri" w:eastAsia="맑은 고딕"/>
           <w:b w:val="0"/>
           <w:i w:val="0"/>
           <w:color w:val="1A1A1A"/>
@@ -1179,7 +1179,7 @@
       </w:pPr>
       <w:r>
         <w:rPr>
-          <w:rFonts w:ascii="NanumGothic" w:hAnsi="NanumGothic" w:eastAsia="NanumGothic"/>
+          <w:rFonts w:ascii="Calibri" w:hAnsi="Calibri" w:eastAsia="맑은 고딕"/>
           <w:b w:val="0"/>
           <w:i w:val="0"/>
           <w:color w:val="1E407C"/>
@@ -1189,7 +1189,7 @@
       </w:r>
       <w:r>
         <w:rPr>
-          <w:rFonts w:ascii="NanumGothic" w:hAnsi="NanumGothic" w:eastAsia="NanumGothic"/>
+          <w:rFonts w:ascii="Calibri" w:hAnsi="Calibri" w:eastAsia="맑은 고딕"/>
           <w:b w:val="0"/>
           <w:i w:val="0"/>
           <w:color w:val="1A1A1A"/>
@@ -1205,7 +1205,7 @@
       </w:pPr>
       <w:r>
         <w:rPr>
-          <w:rFonts w:ascii="NanumGothic" w:hAnsi="NanumGothic" w:eastAsia="NanumGothic"/>
+          <w:rFonts w:ascii="Calibri" w:hAnsi="Calibri" w:eastAsia="맑은 고딕"/>
           <w:b w:val="0"/>
           <w:i w:val="0"/>
           <w:color w:val="1E407C"/>
@@ -1215,7 +1215,7 @@
       </w:r>
       <w:r>
         <w:rPr>
-          <w:rFonts w:ascii="NanumGothic" w:hAnsi="NanumGothic" w:eastAsia="NanumGothic"/>
+          <w:rFonts w:ascii="Calibri" w:hAnsi="Calibri" w:eastAsia="맑은 고딕"/>
           <w:b w:val="0"/>
           <w:i w:val="0"/>
           <w:color w:val="1A1A1A"/>
@@ -1233,7 +1233,7 @@
       </w:pPr>
       <w:r>
         <w:rPr>
-          <w:rFonts w:ascii="NanumGothic" w:hAnsi="NanumGothic" w:eastAsia="NanumGothic"/>
+          <w:rFonts w:ascii="Calibri" w:hAnsi="Calibri" w:eastAsia="맑은 고딕"/>
           <w:b/>
           <w:i w:val="0"/>
           <w:color w:val="B8943A"/>
@@ -1243,7 +1243,7 @@
       </w:r>
       <w:r>
         <w:rPr>
-          <w:rFonts w:ascii="NanumGothic" w:hAnsi="NanumGothic" w:eastAsia="NanumGothic"/>
+          <w:rFonts w:ascii="Calibri" w:hAnsi="Calibri" w:eastAsia="맑은 고딕"/>
           <w:b/>
           <w:i w:val="0"/>
           <w:color w:val="0F2043"/>
@@ -1329,7 +1329,7 @@
             <w:r/>
             <w:r>
               <w:rPr>
-                <w:rFonts w:ascii="NanumGothic" w:hAnsi="NanumGothic" w:eastAsia="NanumGothic"/>
+                <w:rFonts w:ascii="Calibri" w:hAnsi="Calibri" w:eastAsia="맑은 고딕"/>
                 <w:b/>
                 <w:i w:val="0"/>
                 <w:color w:val="FFFFFF"/>
@@ -1357,7 +1357,7 @@
             <w:r/>
             <w:r>
               <w:rPr>
-                <w:rFonts w:ascii="NanumGothic" w:hAnsi="NanumGothic" w:eastAsia="NanumGothic"/>
+                <w:rFonts w:ascii="Calibri" w:hAnsi="Calibri" w:eastAsia="맑은 고딕"/>
                 <w:b/>
                 <w:i w:val="0"/>
                 <w:color w:val="FFFFFF"/>
@@ -1387,7 +1387,7 @@
             <w:r/>
             <w:r>
               <w:rPr>
-                <w:rFonts w:ascii="NanumGothic" w:hAnsi="NanumGothic" w:eastAsia="NanumGothic"/>
+                <w:rFonts w:ascii="Calibri" w:hAnsi="Calibri" w:eastAsia="맑은 고딕"/>
                 <w:b/>
                 <w:i w:val="0"/>
                 <w:color w:val="1A1A1A"/>
@@ -1415,7 +1415,7 @@
             <w:r/>
             <w:r>
               <w:rPr>
-                <w:rFonts w:ascii="NanumGothic" w:hAnsi="NanumGothic" w:eastAsia="NanumGothic"/>
+                <w:rFonts w:ascii="Calibri" w:hAnsi="Calibri" w:eastAsia="맑은 고딕"/>
                 <w:b w:val="0"/>
                 <w:i w:val="0"/>
                 <w:color w:val="1A1A1A"/>
@@ -1445,7 +1445,7 @@
             <w:r/>
             <w:r>
               <w:rPr>
-                <w:rFonts w:ascii="NanumGothic" w:hAnsi="NanumGothic" w:eastAsia="NanumGothic"/>
+                <w:rFonts w:ascii="Calibri" w:hAnsi="Calibri" w:eastAsia="맑은 고딕"/>
                 <w:b/>
                 <w:i w:val="0"/>
                 <w:color w:val="1A1A1A"/>
@@ -1473,7 +1473,7 @@
             <w:r/>
             <w:r>
               <w:rPr>
-                <w:rFonts w:ascii="NanumGothic" w:hAnsi="NanumGothic" w:eastAsia="NanumGothic"/>
+                <w:rFonts w:ascii="Calibri" w:hAnsi="Calibri" w:eastAsia="맑은 고딕"/>
                 <w:b w:val="0"/>
                 <w:i w:val="0"/>
                 <w:color w:val="1A1A1A"/>
@@ -1503,7 +1503,7 @@
             <w:r/>
             <w:r>
               <w:rPr>
-                <w:rFonts w:ascii="NanumGothic" w:hAnsi="NanumGothic" w:eastAsia="NanumGothic"/>
+                <w:rFonts w:ascii="Calibri" w:hAnsi="Calibri" w:eastAsia="맑은 고딕"/>
                 <w:b/>
                 <w:i w:val="0"/>
                 <w:color w:val="1A1A1A"/>
@@ -1531,7 +1531,7 @@
             <w:r/>
             <w:r>
               <w:rPr>
-                <w:rFonts w:ascii="NanumGothic" w:hAnsi="NanumGothic" w:eastAsia="NanumGothic"/>
+                <w:rFonts w:ascii="Calibri" w:hAnsi="Calibri" w:eastAsia="맑은 고딕"/>
                 <w:b w:val="0"/>
                 <w:i w:val="0"/>
                 <w:color w:val="1A1A1A"/>
@@ -1561,7 +1561,7 @@
             <w:r/>
             <w:r>
               <w:rPr>
-                <w:rFonts w:ascii="NanumGothic" w:hAnsi="NanumGothic" w:eastAsia="NanumGothic"/>
+                <w:rFonts w:ascii="Calibri" w:hAnsi="Calibri" w:eastAsia="맑은 고딕"/>
                 <w:b/>
                 <w:i w:val="0"/>
                 <w:color w:val="1A1A1A"/>
@@ -1589,7 +1589,7 @@
             <w:r/>
             <w:r>
               <w:rPr>
-                <w:rFonts w:ascii="NanumGothic" w:hAnsi="NanumGothic" w:eastAsia="NanumGothic"/>
+                <w:rFonts w:ascii="Calibri" w:hAnsi="Calibri" w:eastAsia="맑은 고딕"/>
                 <w:b w:val="0"/>
                 <w:i w:val="0"/>
                 <w:color w:val="1A1A1A"/>
@@ -1619,7 +1619,7 @@
             <w:r/>
             <w:r>
               <w:rPr>
-                <w:rFonts w:ascii="NanumGothic" w:hAnsi="NanumGothic" w:eastAsia="NanumGothic"/>
+                <w:rFonts w:ascii="Calibri" w:hAnsi="Calibri" w:eastAsia="맑은 고딕"/>
                 <w:b/>
                 <w:i w:val="0"/>
                 <w:color w:val="1A1A1A"/>
@@ -1647,7 +1647,7 @@
             <w:r/>
             <w:r>
               <w:rPr>
-                <w:rFonts w:ascii="NanumGothic" w:hAnsi="NanumGothic" w:eastAsia="NanumGothic"/>
+                <w:rFonts w:ascii="Calibri" w:hAnsi="Calibri" w:eastAsia="맑은 고딕"/>
                 <w:b w:val="0"/>
                 <w:i w:val="0"/>
                 <w:color w:val="1A1A1A"/>
@@ -1677,7 +1677,7 @@
             <w:r/>
             <w:r>
               <w:rPr>
-                <w:rFonts w:ascii="NanumGothic" w:hAnsi="NanumGothic" w:eastAsia="NanumGothic"/>
+                <w:rFonts w:ascii="Calibri" w:hAnsi="Calibri" w:eastAsia="맑은 고딕"/>
                 <w:b/>
                 <w:i w:val="0"/>
                 <w:color w:val="1A1A1A"/>
@@ -1705,7 +1705,7 @@
             <w:r/>
             <w:r>
               <w:rPr>
-                <w:rFonts w:ascii="NanumGothic" w:hAnsi="NanumGothic" w:eastAsia="NanumGothic"/>
+                <w:rFonts w:ascii="Calibri" w:hAnsi="Calibri" w:eastAsia="맑은 고딕"/>
                 <w:b w:val="0"/>
                 <w:i w:val="0"/>
                 <w:color w:val="1A1A1A"/>
@@ -1748,7 +1748,7 @@
             <w:r/>
             <w:r>
               <w:rPr>
-                <w:rFonts w:ascii="NanumGothic" w:hAnsi="NanumGothic" w:eastAsia="NanumGothic"/>
+                <w:rFonts w:ascii="Calibri" w:hAnsi="Calibri" w:eastAsia="맑은 고딕"/>
                 <w:b/>
                 <w:i w:val="0"/>
                 <w:color w:val="7A5C12"/>
@@ -1760,7 +1760,7 @@
           <w:p>
             <w:r>
               <w:rPr>
-                <w:rFonts w:ascii="NanumGothic" w:hAnsi="NanumGothic" w:eastAsia="NanumGothic"/>
+                <w:rFonts w:ascii="Calibri" w:hAnsi="Calibri" w:eastAsia="맑은 고딕"/>
                 <w:b w:val="0"/>
                 <w:i w:val="0"/>
                 <w:color w:val="1A1A1A"/>
@@ -1772,7 +1772,7 @@
           <w:p>
             <w:r>
               <w:rPr>
-                <w:rFonts w:ascii="NanumGothic" w:hAnsi="NanumGothic" w:eastAsia="NanumGothic"/>
+                <w:rFonts w:ascii="Calibri" w:hAnsi="Calibri" w:eastAsia="맑은 고딕"/>
                 <w:b w:val="0"/>
                 <w:i w:val="0"/>
                 <w:color w:val="1A1A1A"/>
@@ -1784,7 +1784,7 @@
           <w:p>
             <w:r>
               <w:rPr>
-                <w:rFonts w:ascii="NanumGothic" w:hAnsi="NanumGothic" w:eastAsia="NanumGothic"/>
+                <w:rFonts w:ascii="Calibri" w:hAnsi="Calibri" w:eastAsia="맑은 고딕"/>
                 <w:b w:val="0"/>
                 <w:i w:val="0"/>
                 <w:color w:val="1A1A1A"/>
@@ -1806,7 +1806,7 @@
       </w:pPr>
       <w:r>
         <w:rPr>
-          <w:rFonts w:ascii="NanumGothic" w:hAnsi="NanumGothic" w:eastAsia="NanumGothic"/>
+          <w:rFonts w:ascii="Calibri" w:hAnsi="Calibri" w:eastAsia="맑은 고딕"/>
           <w:b/>
           <w:i w:val="0"/>
           <w:color w:val="B8943A"/>
@@ -1816,7 +1816,7 @@
       </w:r>
       <w:r>
         <w:rPr>
-          <w:rFonts w:ascii="NanumGothic" w:hAnsi="NanumGothic" w:eastAsia="NanumGothic"/>
+          <w:rFonts w:ascii="Calibri" w:hAnsi="Calibri" w:eastAsia="맑은 고딕"/>
           <w:b/>
           <w:i w:val="0"/>
           <w:color w:val="0F2043"/>
@@ -1975,7 +1975,7 @@
             <w:r/>
             <w:r>
               <w:rPr>
-                <w:rFonts w:ascii="NanumGothic" w:hAnsi="NanumGothic" w:eastAsia="NanumGothic"/>
+                <w:rFonts w:ascii="Calibri" w:hAnsi="Calibri" w:eastAsia="맑은 고딕"/>
                 <w:b/>
                 <w:i w:val="0"/>
                 <w:color w:val="0F2043"/>
@@ -1987,7 +1987,7 @@
           <w:p>
             <w:r>
               <w:rPr>
-                <w:rFonts w:ascii="NanumGothic" w:hAnsi="NanumGothic" w:eastAsia="NanumGothic"/>
+                <w:rFonts w:ascii="Calibri" w:hAnsi="Calibri" w:eastAsia="맑은 고딕"/>
                 <w:b w:val="0"/>
                 <w:i w:val="0"/>
                 <w:color w:val="1A1A1A"/>
@@ -1999,7 +1999,7 @@
           <w:p>
             <w:r>
               <w:rPr>
-                <w:rFonts w:ascii="NanumGothic" w:hAnsi="NanumGothic" w:eastAsia="NanumGothic"/>
+                <w:rFonts w:ascii="Calibri" w:hAnsi="Calibri" w:eastAsia="맑은 고딕"/>
                 <w:b w:val="0"/>
                 <w:i w:val="0"/>
                 <w:color w:val="1A1A1A"/>
@@ -2011,7 +2011,7 @@
           <w:p>
             <w:r>
               <w:rPr>
-                <w:rFonts w:ascii="NanumGothic" w:hAnsi="NanumGothic" w:eastAsia="NanumGothic"/>
+                <w:rFonts w:ascii="Calibri" w:hAnsi="Calibri" w:eastAsia="맑은 고딕"/>
                 <w:b w:val="0"/>
                 <w:i w:val="0"/>
                 <w:color w:val="1A1A1A"/>
@@ -2023,7 +2023,7 @@
           <w:p>
             <w:r>
               <w:rPr>
-                <w:rFonts w:ascii="NanumGothic" w:hAnsi="NanumGothic" w:eastAsia="NanumGothic"/>
+                <w:rFonts w:ascii="Calibri" w:hAnsi="Calibri" w:eastAsia="맑은 고딕"/>
                 <w:b w:val="0"/>
                 <w:i w:val="0"/>
                 <w:color w:val="1A1A1A"/>
@@ -2043,7 +2043,7 @@
       </w:pPr>
       <w:r>
         <w:rPr>
-          <w:rFonts w:ascii="NanumGothic" w:hAnsi="NanumGothic" w:eastAsia="NanumGothic"/>
+          <w:rFonts w:ascii="Calibri" w:hAnsi="Calibri" w:eastAsia="맑은 고딕"/>
           <w:b w:val="0"/>
           <w:i w:val="0"/>
           <w:color w:val="1E407C"/>
@@ -2053,7 +2053,7 @@
       </w:r>
       <w:r>
         <w:rPr>
-          <w:rFonts w:ascii="NanumGothic" w:hAnsi="NanumGothic" w:eastAsia="NanumGothic"/>
+          <w:rFonts w:ascii="Calibri" w:hAnsi="Calibri" w:eastAsia="맑은 고딕"/>
           <w:b w:val="0"/>
           <w:i w:val="0"/>
           <w:color w:val="1A1A1A"/>
@@ -2071,7 +2071,7 @@
       </w:pPr>
       <w:r>
         <w:rPr>
-          <w:rFonts w:ascii="NanumGothic" w:hAnsi="NanumGothic" w:eastAsia="NanumGothic"/>
+          <w:rFonts w:ascii="Calibri" w:hAnsi="Calibri" w:eastAsia="맑은 고딕"/>
           <w:b/>
           <w:i w:val="0"/>
           <w:color w:val="B8943A"/>
@@ -2081,7 +2081,7 @@
       </w:r>
       <w:r>
         <w:rPr>
-          <w:rFonts w:ascii="NanumGothic" w:hAnsi="NanumGothic" w:eastAsia="NanumGothic"/>
+          <w:rFonts w:ascii="Calibri" w:hAnsi="Calibri" w:eastAsia="맑은 고딕"/>
           <w:b/>
           <w:i w:val="0"/>
           <w:color w:val="0F2043"/>
@@ -2170,7 +2170,7 @@
             <w:r/>
             <w:r>
               <w:rPr>
-                <w:rFonts w:ascii="NanumGothic" w:hAnsi="NanumGothic" w:eastAsia="NanumGothic"/>
+                <w:rFonts w:ascii="Calibri" w:hAnsi="Calibri" w:eastAsia="맑은 고딕"/>
                 <w:b/>
                 <w:i w:val="0"/>
                 <w:color w:val="FFFFFF"/>
@@ -2198,7 +2198,7 @@
             <w:r/>
             <w:r>
               <w:rPr>
-                <w:rFonts w:ascii="NanumGothic" w:hAnsi="NanumGothic" w:eastAsia="NanumGothic"/>
+                <w:rFonts w:ascii="Calibri" w:hAnsi="Calibri" w:eastAsia="맑은 고딕"/>
                 <w:b/>
                 <w:i w:val="0"/>
                 <w:color w:val="FFFFFF"/>
@@ -2226,7 +2226,7 @@
             <w:r/>
             <w:r>
               <w:rPr>
-                <w:rFonts w:ascii="NanumGothic" w:hAnsi="NanumGothic" w:eastAsia="NanumGothic"/>
+                <w:rFonts w:ascii="Calibri" w:hAnsi="Calibri" w:eastAsia="맑은 고딕"/>
                 <w:b/>
                 <w:i w:val="0"/>
                 <w:color w:val="FFFFFF"/>
@@ -2254,7 +2254,7 @@
             <w:r/>
             <w:r>
               <w:rPr>
-                <w:rFonts w:ascii="NanumGothic" w:hAnsi="NanumGothic" w:eastAsia="NanumGothic"/>
+                <w:rFonts w:ascii="Calibri" w:hAnsi="Calibri" w:eastAsia="맑은 고딕"/>
                 <w:b/>
                 <w:i w:val="0"/>
                 <w:color w:val="FFFFFF"/>
@@ -2282,7 +2282,7 @@
             <w:r/>
             <w:r>
               <w:rPr>
-                <w:rFonts w:ascii="NanumGothic" w:hAnsi="NanumGothic" w:eastAsia="NanumGothic"/>
+                <w:rFonts w:ascii="Calibri" w:hAnsi="Calibri" w:eastAsia="맑은 고딕"/>
                 <w:b/>
                 <w:i w:val="0"/>
                 <w:color w:val="FFFFFF"/>
@@ -2312,7 +2312,7 @@
             <w:r/>
             <w:r>
               <w:rPr>
-                <w:rFonts w:ascii="NanumGothic" w:hAnsi="NanumGothic" w:eastAsia="NanumGothic"/>
+                <w:rFonts w:ascii="Calibri" w:hAnsi="Calibri" w:eastAsia="맑은 고딕"/>
                 <w:b/>
                 <w:i w:val="0"/>
                 <w:color w:val="1A1A1A"/>
@@ -2340,7 +2340,7 @@
             <w:r/>
             <w:r>
               <w:rPr>
-                <w:rFonts w:ascii="NanumGothic" w:hAnsi="NanumGothic" w:eastAsia="NanumGothic"/>
+                <w:rFonts w:ascii="Calibri" w:hAnsi="Calibri" w:eastAsia="맑은 고딕"/>
                 <w:b w:val="0"/>
                 <w:i w:val="0"/>
                 <w:color w:val="1A1A1A"/>
@@ -2368,7 +2368,7 @@
             <w:r/>
             <w:r>
               <w:rPr>
-                <w:rFonts w:ascii="NanumGothic" w:hAnsi="NanumGothic" w:eastAsia="NanumGothic"/>
+                <w:rFonts w:ascii="Calibri" w:hAnsi="Calibri" w:eastAsia="맑은 고딕"/>
                 <w:b w:val="0"/>
                 <w:i w:val="0"/>
                 <w:color w:val="1A1A1A"/>
@@ -2396,7 +2396,7 @@
             <w:r/>
             <w:r>
               <w:rPr>
-                <w:rFonts w:ascii="NanumGothic" w:hAnsi="NanumGothic" w:eastAsia="NanumGothic"/>
+                <w:rFonts w:ascii="Calibri" w:hAnsi="Calibri" w:eastAsia="맑은 고딕"/>
                 <w:b w:val="0"/>
                 <w:i w:val="0"/>
                 <w:color w:val="1A1A1A"/>
@@ -2424,7 +2424,7 @@
             <w:r/>
             <w:r>
               <w:rPr>
-                <w:rFonts w:ascii="NanumGothic" w:hAnsi="NanumGothic" w:eastAsia="NanumGothic"/>
+                <w:rFonts w:ascii="Calibri" w:hAnsi="Calibri" w:eastAsia="맑은 고딕"/>
                 <w:b w:val="0"/>
                 <w:i w:val="0"/>
                 <w:color w:val="1A1A1A"/>
@@ -2454,7 +2454,7 @@
             <w:r/>
             <w:r>
               <w:rPr>
-                <w:rFonts w:ascii="NanumGothic" w:hAnsi="NanumGothic" w:eastAsia="NanumGothic"/>
+                <w:rFonts w:ascii="Calibri" w:hAnsi="Calibri" w:eastAsia="맑은 고딕"/>
                 <w:b/>
                 <w:i w:val="0"/>
                 <w:color w:val="1A1A1A"/>
@@ -2482,7 +2482,7 @@
             <w:r/>
             <w:r>
               <w:rPr>
-                <w:rFonts w:ascii="NanumGothic" w:hAnsi="NanumGothic" w:eastAsia="NanumGothic"/>
+                <w:rFonts w:ascii="Calibri" w:hAnsi="Calibri" w:eastAsia="맑은 고딕"/>
                 <w:b w:val="0"/>
                 <w:i w:val="0"/>
                 <w:color w:val="1A1A1A"/>
@@ -2510,7 +2510,7 @@
             <w:r/>
             <w:r>
               <w:rPr>
-                <w:rFonts w:ascii="NanumGothic" w:hAnsi="NanumGothic" w:eastAsia="NanumGothic"/>
+                <w:rFonts w:ascii="Calibri" w:hAnsi="Calibri" w:eastAsia="맑은 고딕"/>
                 <w:b w:val="0"/>
                 <w:i w:val="0"/>
                 <w:color w:val="1A1A1A"/>
@@ -2538,7 +2538,7 @@
             <w:r/>
             <w:r>
               <w:rPr>
-                <w:rFonts w:ascii="NanumGothic" w:hAnsi="NanumGothic" w:eastAsia="NanumGothic"/>
+                <w:rFonts w:ascii="Calibri" w:hAnsi="Calibri" w:eastAsia="맑은 고딕"/>
                 <w:b w:val="0"/>
                 <w:i w:val="0"/>
                 <w:color w:val="1A1A1A"/>
@@ -2566,7 +2566,7 @@
             <w:r/>
             <w:r>
               <w:rPr>
-                <w:rFonts w:ascii="NanumGothic" w:hAnsi="NanumGothic" w:eastAsia="NanumGothic"/>
+                <w:rFonts w:ascii="Calibri" w:hAnsi="Calibri" w:eastAsia="맑은 고딕"/>
                 <w:b w:val="0"/>
                 <w:i w:val="0"/>
                 <w:color w:val="1A1A1A"/>
@@ -2596,7 +2596,7 @@
             <w:r/>
             <w:r>
               <w:rPr>
-                <w:rFonts w:ascii="NanumGothic" w:hAnsi="NanumGothic" w:eastAsia="NanumGothic"/>
+                <w:rFonts w:ascii="Calibri" w:hAnsi="Calibri" w:eastAsia="맑은 고딕"/>
                 <w:b/>
                 <w:i w:val="0"/>
                 <w:color w:val="1A1A1A"/>
@@ -2624,7 +2624,7 @@
             <w:r/>
             <w:r>
               <w:rPr>
-                <w:rFonts w:ascii="NanumGothic" w:hAnsi="NanumGothic" w:eastAsia="NanumGothic"/>
+                <w:rFonts w:ascii="Calibri" w:hAnsi="Calibri" w:eastAsia="맑은 고딕"/>
                 <w:b w:val="0"/>
                 <w:i w:val="0"/>
                 <w:color w:val="1A1A1A"/>
@@ -2652,7 +2652,7 @@
             <w:r/>
             <w:r>
               <w:rPr>
-                <w:rFonts w:ascii="NanumGothic" w:hAnsi="NanumGothic" w:eastAsia="NanumGothic"/>
+                <w:rFonts w:ascii="Calibri" w:hAnsi="Calibri" w:eastAsia="맑은 고딕"/>
                 <w:b w:val="0"/>
                 <w:i w:val="0"/>
                 <w:color w:val="1A1A1A"/>
@@ -2680,7 +2680,7 @@
             <w:r/>
             <w:r>
               <w:rPr>
-                <w:rFonts w:ascii="NanumGothic" w:hAnsi="NanumGothic" w:eastAsia="NanumGothic"/>
+                <w:rFonts w:ascii="Calibri" w:hAnsi="Calibri" w:eastAsia="맑은 고딕"/>
                 <w:b w:val="0"/>
                 <w:i w:val="0"/>
                 <w:color w:val="1A1A1A"/>
@@ -2708,7 +2708,7 @@
             <w:r/>
             <w:r>
               <w:rPr>
-                <w:rFonts w:ascii="NanumGothic" w:hAnsi="NanumGothic" w:eastAsia="NanumGothic"/>
+                <w:rFonts w:ascii="Calibri" w:hAnsi="Calibri" w:eastAsia="맑은 고딕"/>
                 <w:b w:val="0"/>
                 <w:i w:val="0"/>
                 <w:color w:val="1A1A1A"/>
@@ -2738,7 +2738,7 @@
             <w:r/>
             <w:r>
               <w:rPr>
-                <w:rFonts w:ascii="NanumGothic" w:hAnsi="NanumGothic" w:eastAsia="NanumGothic"/>
+                <w:rFonts w:ascii="Calibri" w:hAnsi="Calibri" w:eastAsia="맑은 고딕"/>
                 <w:b/>
                 <w:i w:val="0"/>
                 <w:color w:val="1A1A1A"/>
@@ -2766,7 +2766,7 @@
             <w:r/>
             <w:r>
               <w:rPr>
-                <w:rFonts w:ascii="NanumGothic" w:hAnsi="NanumGothic" w:eastAsia="NanumGothic"/>
+                <w:rFonts w:ascii="Calibri" w:hAnsi="Calibri" w:eastAsia="맑은 고딕"/>
                 <w:b w:val="0"/>
                 <w:i w:val="0"/>
                 <w:color w:val="1A1A1A"/>
@@ -2794,7 +2794,7 @@
             <w:r/>
             <w:r>
               <w:rPr>
-                <w:rFonts w:ascii="NanumGothic" w:hAnsi="NanumGothic" w:eastAsia="NanumGothic"/>
+                <w:rFonts w:ascii="Calibri" w:hAnsi="Calibri" w:eastAsia="맑은 고딕"/>
                 <w:b w:val="0"/>
                 <w:i w:val="0"/>
                 <w:color w:val="1A1A1A"/>
@@ -2822,7 +2822,7 @@
             <w:r/>
             <w:r>
               <w:rPr>
-                <w:rFonts w:ascii="NanumGothic" w:hAnsi="NanumGothic" w:eastAsia="NanumGothic"/>
+                <w:rFonts w:ascii="Calibri" w:hAnsi="Calibri" w:eastAsia="맑은 고딕"/>
                 <w:b w:val="0"/>
                 <w:i w:val="0"/>
                 <w:color w:val="1A1A1A"/>
@@ -2850,7 +2850,7 @@
             <w:r/>
             <w:r>
               <w:rPr>
-                <w:rFonts w:ascii="NanumGothic" w:hAnsi="NanumGothic" w:eastAsia="NanumGothic"/>
+                <w:rFonts w:ascii="Calibri" w:hAnsi="Calibri" w:eastAsia="맑은 고딕"/>
                 <w:b w:val="0"/>
                 <w:i w:val="0"/>
                 <w:color w:val="1A1A1A"/>
@@ -2880,7 +2880,7 @@
             <w:r/>
             <w:r>
               <w:rPr>
-                <w:rFonts w:ascii="NanumGothic" w:hAnsi="NanumGothic" w:eastAsia="NanumGothic"/>
+                <w:rFonts w:ascii="Calibri" w:hAnsi="Calibri" w:eastAsia="맑은 고딕"/>
                 <w:b/>
                 <w:i w:val="0"/>
                 <w:color w:val="1A1A1A"/>
@@ -2908,7 +2908,7 @@
             <w:r/>
             <w:r>
               <w:rPr>
-                <w:rFonts w:ascii="NanumGothic" w:hAnsi="NanumGothic" w:eastAsia="NanumGothic"/>
+                <w:rFonts w:ascii="Calibri" w:hAnsi="Calibri" w:eastAsia="맑은 고딕"/>
                 <w:b w:val="0"/>
                 <w:i w:val="0"/>
                 <w:color w:val="1A1A1A"/>
@@ -2936,7 +2936,7 @@
             <w:r/>
             <w:r>
               <w:rPr>
-                <w:rFonts w:ascii="NanumGothic" w:hAnsi="NanumGothic" w:eastAsia="NanumGothic"/>
+                <w:rFonts w:ascii="Calibri" w:hAnsi="Calibri" w:eastAsia="맑은 고딕"/>
                 <w:b w:val="0"/>
                 <w:i w:val="0"/>
                 <w:color w:val="1A1A1A"/>
@@ -2964,7 +2964,7 @@
             <w:r/>
             <w:r>
               <w:rPr>
-                <w:rFonts w:ascii="NanumGothic" w:hAnsi="NanumGothic" w:eastAsia="NanumGothic"/>
+                <w:rFonts w:ascii="Calibri" w:hAnsi="Calibri" w:eastAsia="맑은 고딕"/>
                 <w:b w:val="0"/>
                 <w:i w:val="0"/>
                 <w:color w:val="1A1A1A"/>
@@ -2992,7 +2992,7 @@
             <w:r/>
             <w:r>
               <w:rPr>
-                <w:rFonts w:ascii="NanumGothic" w:hAnsi="NanumGothic" w:eastAsia="NanumGothic"/>
+                <w:rFonts w:ascii="Calibri" w:hAnsi="Calibri" w:eastAsia="맑은 고딕"/>
                 <w:b w:val="0"/>
                 <w:i w:val="0"/>
                 <w:color w:val="1A1A1A"/>
@@ -3012,7 +3012,7 @@
       </w:pPr>
       <w:r>
         <w:rPr>
-          <w:rFonts w:ascii="NanumGothic" w:hAnsi="NanumGothic" w:eastAsia="NanumGothic"/>
+          <w:rFonts w:ascii="Calibri" w:hAnsi="Calibri" w:eastAsia="맑은 고딕"/>
           <w:b w:val="0"/>
           <w:i w:val="0"/>
           <w:color w:val="1E407C"/>
@@ -3022,7 +3022,7 @@
       </w:r>
       <w:r>
         <w:rPr>
-          <w:rFonts w:ascii="NanumGothic" w:hAnsi="NanumGothic" w:eastAsia="NanumGothic"/>
+          <w:rFonts w:ascii="Calibri" w:hAnsi="Calibri" w:eastAsia="맑은 고딕"/>
           <w:b w:val="0"/>
           <w:i w:val="0"/>
           <w:color w:val="1A1A1A"/>
@@ -3040,7 +3040,7 @@
       </w:pPr>
       <w:r>
         <w:rPr>
-          <w:rFonts w:ascii="NanumGothic" w:hAnsi="NanumGothic" w:eastAsia="NanumGothic"/>
+          <w:rFonts w:ascii="Calibri" w:hAnsi="Calibri" w:eastAsia="맑은 고딕"/>
           <w:b/>
           <w:i w:val="0"/>
           <w:color w:val="B8943A"/>
@@ -3050,7 +3050,7 @@
       </w:r>
       <w:r>
         <w:rPr>
-          <w:rFonts w:ascii="NanumGothic" w:hAnsi="NanumGothic" w:eastAsia="NanumGothic"/>
+          <w:rFonts w:ascii="Calibri" w:hAnsi="Calibri" w:eastAsia="맑은 고딕"/>
           <w:b/>
           <w:i w:val="0"/>
           <w:color w:val="0F2043"/>
@@ -3146,7 +3146,7 @@
       </w:pPr>
       <w:r>
         <w:rPr>
-          <w:rFonts w:ascii="NanumGothic" w:hAnsi="NanumGothic" w:eastAsia="NanumGothic"/>
+          <w:rFonts w:ascii="Calibri" w:hAnsi="Calibri" w:eastAsia="맑은 고딕"/>
           <w:b w:val="0"/>
           <w:i w:val="0"/>
           <w:color w:val="1E407C"/>
@@ -3156,7 +3156,7 @@
       </w:r>
       <w:r>
         <w:rPr>
-          <w:rFonts w:ascii="NanumGothic" w:hAnsi="NanumGothic" w:eastAsia="NanumGothic"/>
+          <w:rFonts w:ascii="Calibri" w:hAnsi="Calibri" w:eastAsia="맑은 고딕"/>
           <w:b w:val="0"/>
           <w:i w:val="0"/>
           <w:color w:val="1A1A1A"/>
@@ -3172,7 +3172,7 @@
       </w:pPr>
       <w:r>
         <w:rPr>
-          <w:rFonts w:ascii="NanumGothic" w:hAnsi="NanumGothic" w:eastAsia="NanumGothic"/>
+          <w:rFonts w:ascii="Calibri" w:hAnsi="Calibri" w:eastAsia="맑은 고딕"/>
           <w:b w:val="0"/>
           <w:i w:val="0"/>
           <w:color w:val="1E407C"/>
@@ -3182,7 +3182,7 @@
       </w:r>
       <w:r>
         <w:rPr>
-          <w:rFonts w:ascii="NanumGothic" w:hAnsi="NanumGothic" w:eastAsia="NanumGothic"/>
+          <w:rFonts w:ascii="Calibri" w:hAnsi="Calibri" w:eastAsia="맑은 고딕"/>
           <w:b w:val="0"/>
           <w:i w:val="0"/>
           <w:color w:val="1A1A1A"/>
@@ -3198,7 +3198,7 @@
       </w:pPr>
       <w:r>
         <w:rPr>
-          <w:rFonts w:ascii="NanumGothic" w:hAnsi="NanumGothic" w:eastAsia="NanumGothic"/>
+          <w:rFonts w:ascii="Calibri" w:hAnsi="Calibri" w:eastAsia="맑은 고딕"/>
           <w:b w:val="0"/>
           <w:i w:val="0"/>
           <w:color w:val="1E407C"/>
@@ -3208,7 +3208,7 @@
       </w:r>
       <w:r>
         <w:rPr>
-          <w:rFonts w:ascii="NanumGothic" w:hAnsi="NanumGothic" w:eastAsia="NanumGothic"/>
+          <w:rFonts w:ascii="Calibri" w:hAnsi="Calibri" w:eastAsia="맑은 고딕"/>
           <w:b w:val="0"/>
           <w:i w:val="0"/>
           <w:color w:val="1A1A1A"/>
@@ -3224,7 +3224,7 @@
       </w:pPr>
       <w:r>
         <w:rPr>
-          <w:rFonts w:ascii="NanumGothic" w:hAnsi="NanumGothic" w:eastAsia="NanumGothic"/>
+          <w:rFonts w:ascii="Calibri" w:hAnsi="Calibri" w:eastAsia="맑은 고딕"/>
           <w:b w:val="0"/>
           <w:i w:val="0"/>
           <w:color w:val="1E407C"/>
@@ -3234,7 +3234,7 @@
       </w:r>
       <w:r>
         <w:rPr>
-          <w:rFonts w:ascii="NanumGothic" w:hAnsi="NanumGothic" w:eastAsia="NanumGothic"/>
+          <w:rFonts w:ascii="Calibri" w:hAnsi="Calibri" w:eastAsia="맑은 고딕"/>
           <w:b w:val="0"/>
           <w:i w:val="0"/>
           <w:color w:val="1A1A1A"/>
@@ -3252,7 +3252,7 @@
       </w:pPr>
       <w:r>
         <w:rPr>
-          <w:rFonts w:ascii="NanumGothic" w:hAnsi="NanumGothic" w:eastAsia="NanumGothic"/>
+          <w:rFonts w:ascii="Calibri" w:hAnsi="Calibri" w:eastAsia="맑은 고딕"/>
           <w:b/>
           <w:i w:val="0"/>
           <w:color w:val="B8943A"/>
@@ -3262,7 +3262,7 @@
       </w:r>
       <w:r>
         <w:rPr>
-          <w:rFonts w:ascii="NanumGothic" w:hAnsi="NanumGothic" w:eastAsia="NanumGothic"/>
+          <w:rFonts w:ascii="Calibri" w:hAnsi="Calibri" w:eastAsia="맑은 고딕"/>
           <w:b/>
           <w:i w:val="0"/>
           <w:color w:val="0F2043"/>
@@ -3341,7 +3341,7 @@
             <w:r/>
             <w:r>
               <w:rPr>
-                <w:rFonts w:ascii="NanumGothic" w:hAnsi="NanumGothic" w:eastAsia="NanumGothic"/>
+                <w:rFonts w:ascii="Calibri" w:hAnsi="Calibri" w:eastAsia="맑은 고딕"/>
                 <w:b/>
                 <w:i w:val="0"/>
                 <w:color w:val="7A5C12"/>
@@ -3353,7 +3353,7 @@
           <w:p>
             <w:r>
               <w:rPr>
-                <w:rFonts w:ascii="NanumGothic" w:hAnsi="NanumGothic" w:eastAsia="NanumGothic"/>
+                <w:rFonts w:ascii="Calibri" w:hAnsi="Calibri" w:eastAsia="맑은 고딕"/>
                 <w:b w:val="0"/>
                 <w:i w:val="0"/>
                 <w:color w:val="1A1A1A"/>
@@ -3365,7 +3365,7 @@
           <w:p>
             <w:r>
               <w:rPr>
-                <w:rFonts w:ascii="NanumGothic" w:hAnsi="NanumGothic" w:eastAsia="NanumGothic"/>
+                <w:rFonts w:ascii="Calibri" w:hAnsi="Calibri" w:eastAsia="맑은 고딕"/>
                 <w:b w:val="0"/>
                 <w:i w:val="0"/>
                 <w:color w:val="1A1A1A"/>
@@ -3377,7 +3377,7 @@
           <w:p>
             <w:r>
               <w:rPr>
-                <w:rFonts w:ascii="NanumGothic" w:hAnsi="NanumGothic" w:eastAsia="NanumGothic"/>
+                <w:rFonts w:ascii="Calibri" w:hAnsi="Calibri" w:eastAsia="맑은 고딕"/>
                 <w:b w:val="0"/>
                 <w:i w:val="0"/>
                 <w:color w:val="1A1A1A"/>
@@ -3389,7 +3389,7 @@
           <w:p>
             <w:r>
               <w:rPr>
-                <w:rFonts w:ascii="NanumGothic" w:hAnsi="NanumGothic" w:eastAsia="NanumGothic"/>
+                <w:rFonts w:ascii="Calibri" w:hAnsi="Calibri" w:eastAsia="맑은 고딕"/>
                 <w:b w:val="0"/>
                 <w:i w:val="0"/>
                 <w:color w:val="1A1A1A"/>
@@ -3409,7 +3409,7 @@
       </w:pPr>
       <w:r>
         <w:rPr>
-          <w:rFonts w:ascii="NanumGothic" w:hAnsi="NanumGothic" w:eastAsia="NanumGothic"/>
+          <w:rFonts w:ascii="Calibri" w:hAnsi="Calibri" w:eastAsia="맑은 고딕"/>
           <w:b w:val="0"/>
           <w:i w:val="0"/>
           <w:color w:val="1E407C"/>
@@ -3419,7 +3419,7 @@
       </w:r>
       <w:r>
         <w:rPr>
-          <w:rFonts w:ascii="NanumGothic" w:hAnsi="NanumGothic" w:eastAsia="NanumGothic"/>
+          <w:rFonts w:ascii="Calibri" w:hAnsi="Calibri" w:eastAsia="맑은 고딕"/>
           <w:b w:val="0"/>
           <w:i w:val="0"/>
           <w:color w:val="1A1A1A"/>
@@ -3437,7 +3437,7 @@
       </w:pPr>
       <w:r>
         <w:rPr>
-          <w:rFonts w:ascii="NanumGothic" w:hAnsi="NanumGothic" w:eastAsia="NanumGothic"/>
+          <w:rFonts w:ascii="Calibri" w:hAnsi="Calibri" w:eastAsia="맑은 고딕"/>
           <w:b/>
           <w:i w:val="0"/>
           <w:color w:val="B8943A"/>
@@ -3447,7 +3447,7 @@
       </w:r>
       <w:r>
         <w:rPr>
-          <w:rFonts w:ascii="NanumGothic" w:hAnsi="NanumGothic" w:eastAsia="NanumGothic"/>
+          <w:rFonts w:ascii="Calibri" w:hAnsi="Calibri" w:eastAsia="맑은 고딕"/>
           <w:b/>
           <w:i w:val="0"/>
           <w:color w:val="0F2043"/>
@@ -3494,7 +3494,7 @@
             <w:r/>
             <w:r>
               <w:rPr>
-                <w:rFonts w:ascii="NanumGothic" w:hAnsi="NanumGothic" w:eastAsia="NanumGothic"/>
+                <w:rFonts w:ascii="Calibri" w:hAnsi="Calibri" w:eastAsia="맑은 고딕"/>
                 <w:b/>
                 <w:i w:val="0"/>
                 <w:color w:val="FFFFFF"/>
@@ -3522,7 +3522,7 @@
             <w:r/>
             <w:r>
               <w:rPr>
-                <w:rFonts w:ascii="NanumGothic" w:hAnsi="NanumGothic" w:eastAsia="NanumGothic"/>
+                <w:rFonts w:ascii="Calibri" w:hAnsi="Calibri" w:eastAsia="맑은 고딕"/>
                 <w:b/>
                 <w:i w:val="0"/>
                 <w:color w:val="FFFFFF"/>
@@ -3550,7 +3550,7 @@
             <w:r/>
             <w:r>
               <w:rPr>
-                <w:rFonts w:ascii="NanumGothic" w:hAnsi="NanumGothic" w:eastAsia="NanumGothic"/>
+                <w:rFonts w:ascii="Calibri" w:hAnsi="Calibri" w:eastAsia="맑은 고딕"/>
                 <w:b/>
                 <w:i w:val="0"/>
                 <w:color w:val="FFFFFF"/>
@@ -3580,7 +3580,7 @@
             <w:r/>
             <w:r>
               <w:rPr>
-                <w:rFonts w:ascii="NanumGothic" w:hAnsi="NanumGothic" w:eastAsia="NanumGothic"/>
+                <w:rFonts w:ascii="Calibri" w:hAnsi="Calibri" w:eastAsia="맑은 고딕"/>
                 <w:b/>
                 <w:i w:val="0"/>
                 <w:color w:val="1A1A1A"/>
@@ -3608,7 +3608,7 @@
             <w:r/>
             <w:r>
               <w:rPr>
-                <w:rFonts w:ascii="NanumGothic" w:hAnsi="NanumGothic" w:eastAsia="NanumGothic"/>
+                <w:rFonts w:ascii="Calibri" w:hAnsi="Calibri" w:eastAsia="맑은 고딕"/>
                 <w:b w:val="0"/>
                 <w:i w:val="0"/>
                 <w:color w:val="1A1A1A"/>
@@ -3636,7 +3636,7 @@
             <w:r/>
             <w:r>
               <w:rPr>
-                <w:rFonts w:ascii="NanumGothic" w:hAnsi="NanumGothic" w:eastAsia="NanumGothic"/>
+                <w:rFonts w:ascii="Calibri" w:hAnsi="Calibri" w:eastAsia="맑은 고딕"/>
                 <w:b w:val="0"/>
                 <w:i w:val="0"/>
                 <w:color w:val="1A1A1A"/>
@@ -3666,7 +3666,7 @@
             <w:r/>
             <w:r>
               <w:rPr>
-                <w:rFonts w:ascii="NanumGothic" w:hAnsi="NanumGothic" w:eastAsia="NanumGothic"/>
+                <w:rFonts w:ascii="Calibri" w:hAnsi="Calibri" w:eastAsia="맑은 고딕"/>
                 <w:b/>
                 <w:i w:val="0"/>
                 <w:color w:val="1A1A1A"/>
@@ -3694,7 +3694,7 @@
             <w:r/>
             <w:r>
               <w:rPr>
-                <w:rFonts w:ascii="NanumGothic" w:hAnsi="NanumGothic" w:eastAsia="NanumGothic"/>
+                <w:rFonts w:ascii="Calibri" w:hAnsi="Calibri" w:eastAsia="맑은 고딕"/>
                 <w:b w:val="0"/>
                 <w:i w:val="0"/>
                 <w:color w:val="1A1A1A"/>
@@ -3722,7 +3722,7 @@
             <w:r/>
             <w:r>
               <w:rPr>
-                <w:rFonts w:ascii="NanumGothic" w:hAnsi="NanumGothic" w:eastAsia="NanumGothic"/>
+                <w:rFonts w:ascii="Calibri" w:hAnsi="Calibri" w:eastAsia="맑은 고딕"/>
                 <w:b w:val="0"/>
                 <w:i w:val="0"/>
                 <w:color w:val="1A1A1A"/>
@@ -3752,7 +3752,7 @@
             <w:r/>
             <w:r>
               <w:rPr>
-                <w:rFonts w:ascii="NanumGothic" w:hAnsi="NanumGothic" w:eastAsia="NanumGothic"/>
+                <w:rFonts w:ascii="Calibri" w:hAnsi="Calibri" w:eastAsia="맑은 고딕"/>
                 <w:b/>
                 <w:i w:val="0"/>
                 <w:color w:val="1A1A1A"/>
@@ -3780,7 +3780,7 @@
             <w:r/>
             <w:r>
               <w:rPr>
-                <w:rFonts w:ascii="NanumGothic" w:hAnsi="NanumGothic" w:eastAsia="NanumGothic"/>
+                <w:rFonts w:ascii="Calibri" w:hAnsi="Calibri" w:eastAsia="맑은 고딕"/>
                 <w:b w:val="0"/>
                 <w:i w:val="0"/>
                 <w:color w:val="1A1A1A"/>
@@ -3808,7 +3808,7 @@
             <w:r/>
             <w:r>
               <w:rPr>
-                <w:rFonts w:ascii="NanumGothic" w:hAnsi="NanumGothic" w:eastAsia="NanumGothic"/>
+                <w:rFonts w:ascii="Calibri" w:hAnsi="Calibri" w:eastAsia="맑은 고딕"/>
                 <w:b w:val="0"/>
                 <w:i w:val="0"/>
                 <w:color w:val="1A1A1A"/>
@@ -3838,7 +3838,7 @@
             <w:r/>
             <w:r>
               <w:rPr>
-                <w:rFonts w:ascii="NanumGothic" w:hAnsi="NanumGothic" w:eastAsia="NanumGothic"/>
+                <w:rFonts w:ascii="Calibri" w:hAnsi="Calibri" w:eastAsia="맑은 고딕"/>
                 <w:b/>
                 <w:i w:val="0"/>
                 <w:color w:val="1A1A1A"/>
@@ -3866,7 +3866,7 @@
             <w:r/>
             <w:r>
               <w:rPr>
-                <w:rFonts w:ascii="NanumGothic" w:hAnsi="NanumGothic" w:eastAsia="NanumGothic"/>
+                <w:rFonts w:ascii="Calibri" w:hAnsi="Calibri" w:eastAsia="맑은 고딕"/>
                 <w:b w:val="0"/>
                 <w:i w:val="0"/>
                 <w:color w:val="1A1A1A"/>
@@ -3894,7 +3894,7 @@
             <w:r/>
             <w:r>
               <w:rPr>
-                <w:rFonts w:ascii="NanumGothic" w:hAnsi="NanumGothic" w:eastAsia="NanumGothic"/>
+                <w:rFonts w:ascii="Calibri" w:hAnsi="Calibri" w:eastAsia="맑은 고딕"/>
                 <w:b w:val="0"/>
                 <w:i w:val="0"/>
                 <w:color w:val="1A1A1A"/>
@@ -3924,7 +3924,7 @@
             <w:r/>
             <w:r>
               <w:rPr>
-                <w:rFonts w:ascii="NanumGothic" w:hAnsi="NanumGothic" w:eastAsia="NanumGothic"/>
+                <w:rFonts w:ascii="Calibri" w:hAnsi="Calibri" w:eastAsia="맑은 고딕"/>
                 <w:b/>
                 <w:i w:val="0"/>
                 <w:color w:val="1A1A1A"/>
@@ -3952,7 +3952,7 @@
             <w:r/>
             <w:r>
               <w:rPr>
-                <w:rFonts w:ascii="NanumGothic" w:hAnsi="NanumGothic" w:eastAsia="NanumGothic"/>
+                <w:rFonts w:ascii="Calibri" w:hAnsi="Calibri" w:eastAsia="맑은 고딕"/>
                 <w:b w:val="0"/>
                 <w:i w:val="0"/>
                 <w:color w:val="1A1A1A"/>
@@ -3980,7 +3980,7 @@
             <w:r/>
             <w:r>
               <w:rPr>
-                <w:rFonts w:ascii="NanumGothic" w:hAnsi="NanumGothic" w:eastAsia="NanumGothic"/>
+                <w:rFonts w:ascii="Calibri" w:hAnsi="Calibri" w:eastAsia="맑은 고딕"/>
                 <w:b w:val="0"/>
                 <w:i w:val="0"/>
                 <w:color w:val="1A1A1A"/>
@@ -4010,7 +4010,7 @@
             <w:r/>
             <w:r>
               <w:rPr>
-                <w:rFonts w:ascii="NanumGothic" w:hAnsi="NanumGothic" w:eastAsia="NanumGothic"/>
+                <w:rFonts w:ascii="Calibri" w:hAnsi="Calibri" w:eastAsia="맑은 고딕"/>
                 <w:b/>
                 <w:i w:val="0"/>
                 <w:color w:val="1A1A1A"/>
@@ -4038,7 +4038,7 @@
             <w:r/>
             <w:r>
               <w:rPr>
-                <w:rFonts w:ascii="NanumGothic" w:hAnsi="NanumGothic" w:eastAsia="NanumGothic"/>
+                <w:rFonts w:ascii="Calibri" w:hAnsi="Calibri" w:eastAsia="맑은 고딕"/>
                 <w:b w:val="0"/>
                 <w:i w:val="0"/>
                 <w:color w:val="1A1A1A"/>
@@ -4066,7 +4066,7 @@
             <w:r/>
             <w:r>
               <w:rPr>
-                <w:rFonts w:ascii="NanumGothic" w:hAnsi="NanumGothic" w:eastAsia="NanumGothic"/>
+                <w:rFonts w:ascii="Calibri" w:hAnsi="Calibri" w:eastAsia="맑은 고딕"/>
                 <w:b w:val="0"/>
                 <w:i w:val="0"/>
                 <w:color w:val="1A1A1A"/>
@@ -4096,7 +4096,7 @@
             <w:r/>
             <w:r>
               <w:rPr>
-                <w:rFonts w:ascii="NanumGothic" w:hAnsi="NanumGothic" w:eastAsia="NanumGothic"/>
+                <w:rFonts w:ascii="Calibri" w:hAnsi="Calibri" w:eastAsia="맑은 고딕"/>
                 <w:b/>
                 <w:i w:val="0"/>
                 <w:color w:val="1A1A1A"/>
@@ -4124,7 +4124,7 @@
             <w:r/>
             <w:r>
               <w:rPr>
-                <w:rFonts w:ascii="NanumGothic" w:hAnsi="NanumGothic" w:eastAsia="NanumGothic"/>
+                <w:rFonts w:ascii="Calibri" w:hAnsi="Calibri" w:eastAsia="맑은 고딕"/>
                 <w:b w:val="0"/>
                 <w:i w:val="0"/>
                 <w:color w:val="1A1A1A"/>
@@ -4152,7 +4152,7 @@
             <w:r/>
             <w:r>
               <w:rPr>
-                <w:rFonts w:ascii="NanumGothic" w:hAnsi="NanumGothic" w:eastAsia="NanumGothic"/>
+                <w:rFonts w:ascii="Calibri" w:hAnsi="Calibri" w:eastAsia="맑은 고딕"/>
                 <w:b w:val="0"/>
                 <w:i w:val="0"/>
                 <w:color w:val="1A1A1A"/>
@@ -4174,7 +4174,7 @@
       </w:pPr>
       <w:r>
         <w:rPr>
-          <w:rFonts w:ascii="NanumGothic" w:hAnsi="NanumGothic" w:eastAsia="NanumGothic"/>
+          <w:rFonts w:ascii="Calibri" w:hAnsi="Calibri" w:eastAsia="맑은 고딕"/>
           <w:b/>
           <w:i w:val="0"/>
           <w:color w:val="B8943A"/>
@@ -4184,7 +4184,7 @@
       </w:r>
       <w:r>
         <w:rPr>
-          <w:rFonts w:ascii="NanumGothic" w:hAnsi="NanumGothic" w:eastAsia="NanumGothic"/>
+          <w:rFonts w:ascii="Calibri" w:hAnsi="Calibri" w:eastAsia="맑은 고딕"/>
           <w:b/>
           <w:i w:val="0"/>
           <w:color w:val="0F2043"/>
@@ -4232,7 +4232,7 @@
             <w:r/>
             <w:r>
               <w:rPr>
-                <w:rFonts w:ascii="NanumGothic" w:hAnsi="NanumGothic" w:eastAsia="NanumGothic"/>
+                <w:rFonts w:ascii="Calibri" w:hAnsi="Calibri" w:eastAsia="맑은 고딕"/>
                 <w:b/>
                 <w:i w:val="0"/>
                 <w:color w:val="FFFFFF"/>
@@ -4260,7 +4260,7 @@
             <w:r/>
             <w:r>
               <w:rPr>
-                <w:rFonts w:ascii="NanumGothic" w:hAnsi="NanumGothic" w:eastAsia="NanumGothic"/>
+                <w:rFonts w:ascii="Calibri" w:hAnsi="Calibri" w:eastAsia="맑은 고딕"/>
                 <w:b/>
                 <w:i w:val="0"/>
                 <w:color w:val="FFFFFF"/>
@@ -4288,7 +4288,7 @@
             <w:r/>
             <w:r>
               <w:rPr>
-                <w:rFonts w:ascii="NanumGothic" w:hAnsi="NanumGothic" w:eastAsia="NanumGothic"/>
+                <w:rFonts w:ascii="Calibri" w:hAnsi="Calibri" w:eastAsia="맑은 고딕"/>
                 <w:b/>
                 <w:i w:val="0"/>
                 <w:color w:val="FFFFFF"/>
@@ -4316,7 +4316,7 @@
             <w:r/>
             <w:r>
               <w:rPr>
-                <w:rFonts w:ascii="NanumGothic" w:hAnsi="NanumGothic" w:eastAsia="NanumGothic"/>
+                <w:rFonts w:ascii="Calibri" w:hAnsi="Calibri" w:eastAsia="맑은 고딕"/>
                 <w:b/>
                 <w:i w:val="0"/>
                 <w:color w:val="FFFFFF"/>
@@ -4346,7 +4346,7 @@
             <w:r/>
             <w:r>
               <w:rPr>
-                <w:rFonts w:ascii="NanumGothic" w:hAnsi="NanumGothic" w:eastAsia="NanumGothic"/>
+                <w:rFonts w:ascii="Calibri" w:hAnsi="Calibri" w:eastAsia="맑은 고딕"/>
                 <w:b/>
                 <w:i w:val="0"/>
                 <w:color w:val="1A1A1A"/>
@@ -4374,7 +4374,7 @@
             <w:r/>
             <w:r>
               <w:rPr>
-                <w:rFonts w:ascii="NanumGothic" w:hAnsi="NanumGothic" w:eastAsia="NanumGothic"/>
+                <w:rFonts w:ascii="Calibri" w:hAnsi="Calibri" w:eastAsia="맑은 고딕"/>
                 <w:b w:val="0"/>
                 <w:i w:val="0"/>
                 <w:color w:val="1A1A1A"/>
@@ -4402,7 +4402,7 @@
             <w:r/>
             <w:r>
               <w:rPr>
-                <w:rFonts w:ascii="NanumGothic" w:hAnsi="NanumGothic" w:eastAsia="NanumGothic"/>
+                <w:rFonts w:ascii="Calibri" w:hAnsi="Calibri" w:eastAsia="맑은 고딕"/>
                 <w:b w:val="0"/>
                 <w:i w:val="0"/>
                 <w:color w:val="1A1A1A"/>
@@ -4430,7 +4430,7 @@
             <w:r/>
             <w:r>
               <w:rPr>
-                <w:rFonts w:ascii="NanumGothic" w:hAnsi="NanumGothic" w:eastAsia="NanumGothic"/>
+                <w:rFonts w:ascii="Calibri" w:hAnsi="Calibri" w:eastAsia="맑은 고딕"/>
                 <w:b w:val="0"/>
                 <w:i w:val="0"/>
                 <w:color w:val="1A1A1A"/>
@@ -4460,7 +4460,7 @@
             <w:r/>
             <w:r>
               <w:rPr>
-                <w:rFonts w:ascii="NanumGothic" w:hAnsi="NanumGothic" w:eastAsia="NanumGothic"/>
+                <w:rFonts w:ascii="Calibri" w:hAnsi="Calibri" w:eastAsia="맑은 고딕"/>
                 <w:b/>
                 <w:i w:val="0"/>
                 <w:color w:val="1A1A1A"/>
@@ -4488,7 +4488,7 @@
             <w:r/>
             <w:r>
               <w:rPr>
-                <w:rFonts w:ascii="NanumGothic" w:hAnsi="NanumGothic" w:eastAsia="NanumGothic"/>
+                <w:rFonts w:ascii="Calibri" w:hAnsi="Calibri" w:eastAsia="맑은 고딕"/>
                 <w:b w:val="0"/>
                 <w:i w:val="0"/>
                 <w:color w:val="1A1A1A"/>
@@ -4516,7 +4516,7 @@
             <w:r/>
             <w:r>
               <w:rPr>
-                <w:rFonts w:ascii="NanumGothic" w:hAnsi="NanumGothic" w:eastAsia="NanumGothic"/>
+                <w:rFonts w:ascii="Calibri" w:hAnsi="Calibri" w:eastAsia="맑은 고딕"/>
                 <w:b w:val="0"/>
                 <w:i w:val="0"/>
                 <w:color w:val="1A1A1A"/>
@@ -4544,7 +4544,7 @@
             <w:r/>
             <w:r>
               <w:rPr>
-                <w:rFonts w:ascii="NanumGothic" w:hAnsi="NanumGothic" w:eastAsia="NanumGothic"/>
+                <w:rFonts w:ascii="Calibri" w:hAnsi="Calibri" w:eastAsia="맑은 고딕"/>
                 <w:b w:val="0"/>
                 <w:i w:val="0"/>
                 <w:color w:val="1A1A1A"/>
@@ -4574,7 +4574,7 @@
             <w:r/>
             <w:r>
               <w:rPr>
-                <w:rFonts w:ascii="NanumGothic" w:hAnsi="NanumGothic" w:eastAsia="NanumGothic"/>
+                <w:rFonts w:ascii="Calibri" w:hAnsi="Calibri" w:eastAsia="맑은 고딕"/>
                 <w:b/>
                 <w:i w:val="0"/>
                 <w:color w:val="1A1A1A"/>
@@ -4602,7 +4602,7 @@
             <w:r/>
             <w:r>
               <w:rPr>
-                <w:rFonts w:ascii="NanumGothic" w:hAnsi="NanumGothic" w:eastAsia="NanumGothic"/>
+                <w:rFonts w:ascii="Calibri" w:hAnsi="Calibri" w:eastAsia="맑은 고딕"/>
                 <w:b w:val="0"/>
                 <w:i w:val="0"/>
                 <w:color w:val="1A1A1A"/>
@@ -4630,7 +4630,7 @@
             <w:r/>
             <w:r>
               <w:rPr>
-                <w:rFonts w:ascii="NanumGothic" w:hAnsi="NanumGothic" w:eastAsia="NanumGothic"/>
+                <w:rFonts w:ascii="Calibri" w:hAnsi="Calibri" w:eastAsia="맑은 고딕"/>
                 <w:b w:val="0"/>
                 <w:i w:val="0"/>
                 <w:color w:val="1A1A1A"/>
@@ -4658,7 +4658,7 @@
             <w:r/>
             <w:r>
               <w:rPr>
-                <w:rFonts w:ascii="NanumGothic" w:hAnsi="NanumGothic" w:eastAsia="NanumGothic"/>
+                <w:rFonts w:ascii="Calibri" w:hAnsi="Calibri" w:eastAsia="맑은 고딕"/>
                 <w:b w:val="0"/>
                 <w:i w:val="0"/>
                 <w:color w:val="1A1A1A"/>
@@ -4688,7 +4688,7 @@
             <w:r/>
             <w:r>
               <w:rPr>
-                <w:rFonts w:ascii="NanumGothic" w:hAnsi="NanumGothic" w:eastAsia="NanumGothic"/>
+                <w:rFonts w:ascii="Calibri" w:hAnsi="Calibri" w:eastAsia="맑은 고딕"/>
                 <w:b/>
                 <w:i w:val="0"/>
                 <w:color w:val="1A1A1A"/>
@@ -4716,7 +4716,7 @@
             <w:r/>
             <w:r>
               <w:rPr>
-                <w:rFonts w:ascii="NanumGothic" w:hAnsi="NanumGothic" w:eastAsia="NanumGothic"/>
+                <w:rFonts w:ascii="Calibri" w:hAnsi="Calibri" w:eastAsia="맑은 고딕"/>
                 <w:b w:val="0"/>
                 <w:i w:val="0"/>
                 <w:color w:val="1A1A1A"/>
@@ -4744,7 +4744,7 @@
             <w:r/>
             <w:r>
               <w:rPr>
-                <w:rFonts w:ascii="NanumGothic" w:hAnsi="NanumGothic" w:eastAsia="NanumGothic"/>
+                <w:rFonts w:ascii="Calibri" w:hAnsi="Calibri" w:eastAsia="맑은 고딕"/>
                 <w:b w:val="0"/>
                 <w:i w:val="0"/>
                 <w:color w:val="1A1A1A"/>
@@ -4772,7 +4772,7 @@
             <w:r/>
             <w:r>
               <w:rPr>
-                <w:rFonts w:ascii="NanumGothic" w:hAnsi="NanumGothic" w:eastAsia="NanumGothic"/>
+                <w:rFonts w:ascii="Calibri" w:hAnsi="Calibri" w:eastAsia="맑은 고딕"/>
                 <w:b w:val="0"/>
                 <w:i w:val="0"/>
                 <w:color w:val="1A1A1A"/>
@@ -4802,7 +4802,7 @@
             <w:r/>
             <w:r>
               <w:rPr>
-                <w:rFonts w:ascii="NanumGothic" w:hAnsi="NanumGothic" w:eastAsia="NanumGothic"/>
+                <w:rFonts w:ascii="Calibri" w:hAnsi="Calibri" w:eastAsia="맑은 고딕"/>
                 <w:b/>
                 <w:i w:val="0"/>
                 <w:color w:val="1A1A1A"/>
@@ -4830,7 +4830,7 @@
             <w:r/>
             <w:r>
               <w:rPr>
-                <w:rFonts w:ascii="NanumGothic" w:hAnsi="NanumGothic" w:eastAsia="NanumGothic"/>
+                <w:rFonts w:ascii="Calibri" w:hAnsi="Calibri" w:eastAsia="맑은 고딕"/>
                 <w:b w:val="0"/>
                 <w:i w:val="0"/>
                 <w:color w:val="1A1A1A"/>
@@ -4858,7 +4858,7 @@
             <w:r/>
             <w:r>
               <w:rPr>
-                <w:rFonts w:ascii="NanumGothic" w:hAnsi="NanumGothic" w:eastAsia="NanumGothic"/>
+                <w:rFonts w:ascii="Calibri" w:hAnsi="Calibri" w:eastAsia="맑은 고딕"/>
                 <w:b w:val="0"/>
                 <w:i w:val="0"/>
                 <w:color w:val="1A1A1A"/>
@@ -4886,7 +4886,7 @@
             <w:r/>
             <w:r>
               <w:rPr>
-                <w:rFonts w:ascii="NanumGothic" w:hAnsi="NanumGothic" w:eastAsia="NanumGothic"/>
+                <w:rFonts w:ascii="Calibri" w:hAnsi="Calibri" w:eastAsia="맑은 고딕"/>
                 <w:b w:val="0"/>
                 <w:i w:val="0"/>
                 <w:color w:val="1A1A1A"/>
@@ -4916,7 +4916,7 @@
             <w:r/>
             <w:r>
               <w:rPr>
-                <w:rFonts w:ascii="NanumGothic" w:hAnsi="NanumGothic" w:eastAsia="NanumGothic"/>
+                <w:rFonts w:ascii="Calibri" w:hAnsi="Calibri" w:eastAsia="맑은 고딕"/>
                 <w:b/>
                 <w:i w:val="0"/>
                 <w:color w:val="1A1A1A"/>
@@ -4944,7 +4944,7 @@
             <w:r/>
             <w:r>
               <w:rPr>
-                <w:rFonts w:ascii="NanumGothic" w:hAnsi="NanumGothic" w:eastAsia="NanumGothic"/>
+                <w:rFonts w:ascii="Calibri" w:hAnsi="Calibri" w:eastAsia="맑은 고딕"/>
                 <w:b w:val="0"/>
                 <w:i w:val="0"/>
                 <w:color w:val="1A1A1A"/>
@@ -4972,7 +4972,7 @@
             <w:r/>
             <w:r>
               <w:rPr>
-                <w:rFonts w:ascii="NanumGothic" w:hAnsi="NanumGothic" w:eastAsia="NanumGothic"/>
+                <w:rFonts w:ascii="Calibri" w:hAnsi="Calibri" w:eastAsia="맑은 고딕"/>
                 <w:b w:val="0"/>
                 <w:i w:val="0"/>
                 <w:color w:val="1A1A1A"/>
@@ -5000,7 +5000,7 @@
             <w:r/>
             <w:r>
               <w:rPr>
-                <w:rFonts w:ascii="NanumGothic" w:hAnsi="NanumGothic" w:eastAsia="NanumGothic"/>
+                <w:rFonts w:ascii="Calibri" w:hAnsi="Calibri" w:eastAsia="맑은 고딕"/>
                 <w:b w:val="0"/>
                 <w:i w:val="0"/>
                 <w:color w:val="1A1A1A"/>
@@ -5030,7 +5030,7 @@
             <w:r/>
             <w:r>
               <w:rPr>
-                <w:rFonts w:ascii="NanumGothic" w:hAnsi="NanumGothic" w:eastAsia="NanumGothic"/>
+                <w:rFonts w:ascii="Calibri" w:hAnsi="Calibri" w:eastAsia="맑은 고딕"/>
                 <w:b/>
                 <w:i w:val="0"/>
                 <w:color w:val="1A1A1A"/>
@@ -5058,7 +5058,7 @@
             <w:r/>
             <w:r>
               <w:rPr>
-                <w:rFonts w:ascii="NanumGothic" w:hAnsi="NanumGothic" w:eastAsia="NanumGothic"/>
+                <w:rFonts w:ascii="Calibri" w:hAnsi="Calibri" w:eastAsia="맑은 고딕"/>
                 <w:b w:val="0"/>
                 <w:i w:val="0"/>
                 <w:color w:val="1A1A1A"/>
@@ -5086,7 +5086,7 @@
             <w:r/>
             <w:r>
               <w:rPr>
-                <w:rFonts w:ascii="NanumGothic" w:hAnsi="NanumGothic" w:eastAsia="NanumGothic"/>
+                <w:rFonts w:ascii="Calibri" w:hAnsi="Calibri" w:eastAsia="맑은 고딕"/>
                 <w:b w:val="0"/>
                 <w:i w:val="0"/>
                 <w:color w:val="1A1A1A"/>
@@ -5114,7 +5114,7 @@
             <w:r/>
             <w:r>
               <w:rPr>
-                <w:rFonts w:ascii="NanumGothic" w:hAnsi="NanumGothic" w:eastAsia="NanumGothic"/>
+                <w:rFonts w:ascii="Calibri" w:hAnsi="Calibri" w:eastAsia="맑은 고딕"/>
                 <w:b w:val="0"/>
                 <w:i w:val="0"/>
                 <w:color w:val="1A1A1A"/>
@@ -5157,7 +5157,7 @@
             <w:r/>
             <w:r>
               <w:rPr>
-                <w:rFonts w:ascii="NanumGothic" w:hAnsi="NanumGothic" w:eastAsia="NanumGothic"/>
+                <w:rFonts w:ascii="Calibri" w:hAnsi="Calibri" w:eastAsia="맑은 고딕"/>
                 <w:b/>
                 <w:i w:val="0"/>
                 <w:color w:val="0F2043"/>
@@ -5169,7 +5169,7 @@
           <w:p>
             <w:r>
               <w:rPr>
-                <w:rFonts w:ascii="NanumGothic" w:hAnsi="NanumGothic" w:eastAsia="NanumGothic"/>
+                <w:rFonts w:ascii="Calibri" w:hAnsi="Calibri" w:eastAsia="맑은 고딕"/>
                 <w:b w:val="0"/>
                 <w:i w:val="0"/>
                 <w:color w:val="1A1A1A"/>
@@ -5181,7 +5181,7 @@
           <w:p>
             <w:r>
               <w:rPr>
-                <w:rFonts w:ascii="NanumGothic" w:hAnsi="NanumGothic" w:eastAsia="NanumGothic"/>
+                <w:rFonts w:ascii="Calibri" w:hAnsi="Calibri" w:eastAsia="맑은 고딕"/>
                 <w:b w:val="0"/>
                 <w:i w:val="0"/>
                 <w:color w:val="1A1A1A"/>
@@ -5193,7 +5193,7 @@
           <w:p>
             <w:r>
               <w:rPr>
-                <w:rFonts w:ascii="NanumGothic" w:hAnsi="NanumGothic" w:eastAsia="NanumGothic"/>
+                <w:rFonts w:ascii="Calibri" w:hAnsi="Calibri" w:eastAsia="맑은 고딕"/>
                 <w:b w:val="0"/>
                 <w:i w:val="0"/>
                 <w:color w:val="1A1A1A"/>
@@ -5205,7 +5205,7 @@
           <w:p>
             <w:r>
               <w:rPr>
-                <w:rFonts w:ascii="NanumGothic" w:hAnsi="NanumGothic" w:eastAsia="NanumGothic"/>
+                <w:rFonts w:ascii="Calibri" w:hAnsi="Calibri" w:eastAsia="맑은 고딕"/>
                 <w:b w:val="0"/>
                 <w:i w:val="0"/>
                 <w:color w:val="1A1A1A"/>
@@ -5225,7 +5225,7 @@
       </w:pPr>
       <w:r>
         <w:rPr>
-          <w:rFonts w:ascii="NanumGothic" w:hAnsi="NanumGothic" w:eastAsia="NanumGothic"/>
+          <w:rFonts w:ascii="Calibri" w:hAnsi="Calibri" w:eastAsia="맑은 고딕"/>
           <w:b w:val="0"/>
           <w:i w:val="0"/>
           <w:color w:val="4B5563"/>
@@ -5255,7 +5255,7 @@
     </w:pPr>
     <w:r>
       <w:rPr>
-        <w:rFonts w:ascii="NanumGothic" w:hAnsi="NanumGothic" w:eastAsia="NanumGothic"/>
+        <w:rFonts w:ascii="Calibri" w:hAnsi="Calibri" w:eastAsia="맑은 고딕"/>
         <w:b w:val="0"/>
         <w:i w:val="0"/>
         <w:color w:val="4B5563"/>
@@ -5276,7 +5276,7 @@
     </w:pPr>
     <w:r>
       <w:rPr>
-        <w:rFonts w:ascii="NanumGothic" w:hAnsi="NanumGothic" w:eastAsia="NanumGothic"/>
+        <w:rFonts w:ascii="Calibri" w:hAnsi="Calibri" w:eastAsia="맑은 고딕"/>
         <w:b w:val="0"/>
         <w:i w:val="0"/>
         <w:color w:val="4B5563"/>
@@ -5652,7 +5652,7 @@
     <w:qFormat/>
     <w:rsid w:val="00FC693F"/>
     <w:rPr>
-      <w:rFonts w:ascii="NanumGothic" w:hAnsi="NanumGothic" w:eastAsia="NanumGothic"/>
+      <w:rFonts w:ascii="맑은 고딕" w:hAnsi="맑은 고딕" w:eastAsia="맑은 고딕"/>
       <w:sz w:val="22"/>
     </w:rPr>
   </w:style>

</xml_diff>